<commit_message>
docs: populate toc and expand core code excerpts
</commit_message>
<xml_diff>
--- a/report/实验报告.docx
+++ b/report/实验报告.docx
@@ -418,7 +418,239 @@
         <w:t>目录</w:t>
       </w:r>
     </w:p>
-    <w:fldSimple w:instr="TOC \o &quot;1-2&quot; \h \z \u"/>
+    <w:p>
+      <w:pPr>
+        <w:spacing w:after="200"/>
+      </w:pPr>
+      <w:r>
+        <w:t>本目录为确定性静态目录，避免不同 Word 版本未更新域时出现空白。</w:t>
+      </w:r>
+    </w:p>
+    <w:p>
+      <w:pPr>
+        <w:pStyle w:val="TOCEntry"/>
+        <w:spacing w:after="120"/>
+        <w:ind w:left="259"/>
+      </w:pPr>
+      <w:r>
+        <w:rPr>
+          <w:rFonts w:ascii="Arial Unicode MS" w:hAnsi="Arial Unicode MS" w:eastAsia="Arial Unicode MS"/>
+          <w:b/>
+          <w:color w:val="1F4D78"/>
+          <w:sz w:val="22"/>
+        </w:rPr>
+        <w:t>摘要</w:t>
+      </w:r>
+      <w:r>
+        <w:rPr>
+          <w:rFonts w:ascii="Arial Unicode MS" w:hAnsi="Arial Unicode MS" w:eastAsia="Arial Unicode MS"/>
+          <w:b w:val="0"/>
+          <w:color w:val="666666"/>
+          <w:sz w:val="19"/>
+        </w:rPr>
+        <w:t xml:space="preserve">    报告工作概述</w:t>
+      </w:r>
+    </w:p>
+    <w:p>
+      <w:pPr>
+        <w:pStyle w:val="TOCEntry"/>
+        <w:spacing w:after="120"/>
+        <w:ind w:left="259"/>
+      </w:pPr>
+      <w:r>
+        <w:rPr>
+          <w:rFonts w:ascii="Arial Unicode MS" w:hAnsi="Arial Unicode MS" w:eastAsia="Arial Unicode MS"/>
+          <w:b/>
+          <w:color w:val="1F4D78"/>
+          <w:sz w:val="22"/>
+        </w:rPr>
+        <w:t>1. 设计任务要求</w:t>
+      </w:r>
+      <w:r>
+        <w:rPr>
+          <w:rFonts w:ascii="Arial Unicode MS" w:hAnsi="Arial Unicode MS" w:eastAsia="Arial Unicode MS"/>
+          <w:b w:val="0"/>
+          <w:color w:val="666666"/>
+          <w:sz w:val="19"/>
+        </w:rPr>
+        <w:t xml:space="preserve">    实验目标与功能边界</w:t>
+      </w:r>
+    </w:p>
+    <w:p>
+      <w:pPr>
+        <w:pStyle w:val="TOCEntry"/>
+        <w:spacing w:after="120"/>
+        <w:ind w:left="259"/>
+      </w:pPr>
+      <w:r>
+        <w:rPr>
+          <w:rFonts w:ascii="Arial Unicode MS" w:hAnsi="Arial Unicode MS" w:eastAsia="Arial Unicode MS"/>
+          <w:b/>
+          <w:color w:val="1F4D78"/>
+          <w:sz w:val="22"/>
+        </w:rPr>
+        <w:t>2. 代码分析</w:t>
+      </w:r>
+      <w:r>
+        <w:rPr>
+          <w:rFonts w:ascii="Arial Unicode MS" w:hAnsi="Arial Unicode MS" w:eastAsia="Arial Unicode MS"/>
+          <w:b w:val="0"/>
+          <w:color w:val="666666"/>
+          <w:sz w:val="19"/>
+        </w:rPr>
+        <w:t xml:space="preserve">    模块、数据结构与核心代码</w:t>
+      </w:r>
+    </w:p>
+    <w:p>
+      <w:pPr>
+        <w:pStyle w:val="TOCEntry"/>
+        <w:spacing w:after="120"/>
+        <w:ind w:left="259"/>
+      </w:pPr>
+      <w:r>
+        <w:rPr>
+          <w:rFonts w:ascii="Arial Unicode MS" w:hAnsi="Arial Unicode MS" w:eastAsia="Arial Unicode MS"/>
+          <w:b/>
+          <w:color w:val="1F4D78"/>
+          <w:sz w:val="22"/>
+        </w:rPr>
+        <w:t>3. 设计方案</w:t>
+      </w:r>
+      <w:r>
+        <w:rPr>
+          <w:rFonts w:ascii="Arial Unicode MS" w:hAnsi="Arial Unicode MS" w:eastAsia="Arial Unicode MS"/>
+          <w:b w:val="0"/>
+          <w:color w:val="666666"/>
+          <w:sz w:val="19"/>
+        </w:rPr>
+        <w:t xml:space="preserve">    算法与资源生命周期设计</w:t>
+      </w:r>
+    </w:p>
+    <w:p>
+      <w:pPr>
+        <w:pStyle w:val="TOCEntry"/>
+        <w:spacing w:after="120"/>
+        <w:ind w:left="259"/>
+      </w:pPr>
+      <w:r>
+        <w:rPr>
+          <w:rFonts w:ascii="Arial Unicode MS" w:hAnsi="Arial Unicode MS" w:eastAsia="Arial Unicode MS"/>
+          <w:b/>
+          <w:color w:val="1F4D78"/>
+          <w:sz w:val="22"/>
+        </w:rPr>
+        <w:t>4. 实现说明</w:t>
+      </w:r>
+      <w:r>
+        <w:rPr>
+          <w:rFonts w:ascii="Arial Unicode MS" w:hAnsi="Arial Unicode MS" w:eastAsia="Arial Unicode MS"/>
+          <w:b w:val="0"/>
+          <w:color w:val="666666"/>
+          <w:sz w:val="19"/>
+        </w:rPr>
+        <w:t xml:space="preserve">    修改范围与实现理由</w:t>
+      </w:r>
+    </w:p>
+    <w:p>
+      <w:pPr>
+        <w:pStyle w:val="TOCEntry"/>
+        <w:spacing w:after="120"/>
+        <w:ind w:left="259"/>
+      </w:pPr>
+      <w:r>
+        <w:rPr>
+          <w:rFonts w:ascii="Arial Unicode MS" w:hAnsi="Arial Unicode MS" w:eastAsia="Arial Unicode MS"/>
+          <w:b/>
+          <w:color w:val="1F4D78"/>
+          <w:sz w:val="22"/>
+        </w:rPr>
+        <w:t>5. 测试与结果</w:t>
+      </w:r>
+      <w:r>
+        <w:rPr>
+          <w:rFonts w:ascii="Arial Unicode MS" w:hAnsi="Arial Unicode MS" w:eastAsia="Arial Unicode MS"/>
+          <w:b w:val="0"/>
+          <w:color w:val="666666"/>
+          <w:sz w:val="19"/>
+        </w:rPr>
+        <w:t xml:space="preserve">    测试命令、结果与限制</w:t>
+      </w:r>
+    </w:p>
+    <w:p>
+      <w:pPr>
+        <w:pStyle w:val="TOCEntry"/>
+        <w:spacing w:after="120"/>
+        <w:ind w:left="259"/>
+      </w:pPr>
+      <w:r>
+        <w:rPr>
+          <w:rFonts w:ascii="Arial Unicode MS" w:hAnsi="Arial Unicode MS" w:eastAsia="Arial Unicode MS"/>
+          <w:b/>
+          <w:color w:val="1F4D78"/>
+          <w:sz w:val="22"/>
+        </w:rPr>
+        <w:t>6. 调试与问题分析</w:t>
+      </w:r>
+      <w:r>
+        <w:rPr>
+          <w:rFonts w:ascii="Arial Unicode MS" w:hAnsi="Arial Unicode MS" w:eastAsia="Arial Unicode MS"/>
+          <w:b w:val="0"/>
+          <w:color w:val="666666"/>
+          <w:sz w:val="19"/>
+        </w:rPr>
+        <w:t xml:space="preserve">    风险、问题与改进建议</w:t>
+      </w:r>
+    </w:p>
+    <w:p>
+      <w:pPr>
+        <w:pStyle w:val="TOCEntry"/>
+        <w:spacing w:after="120"/>
+        <w:ind w:left="259"/>
+      </w:pPr>
+      <w:r>
+        <w:rPr>
+          <w:rFonts w:ascii="Arial Unicode MS" w:hAnsi="Arial Unicode MS" w:eastAsia="Arial Unicode MS"/>
+          <w:b/>
+          <w:color w:val="1F4D78"/>
+          <w:sz w:val="22"/>
+        </w:rPr>
+        <w:t>7. 结论与展望</w:t>
+      </w:r>
+      <w:r>
+        <w:rPr>
+          <w:rFonts w:ascii="Arial Unicode MS" w:hAnsi="Arial Unicode MS" w:eastAsia="Arial Unicode MS"/>
+          <w:b w:val="0"/>
+          <w:color w:val="666666"/>
+          <w:sz w:val="19"/>
+        </w:rPr>
+        <w:t xml:space="preserve">    工作总结与后续计划</w:t>
+      </w:r>
+    </w:p>
+    <w:p>
+      <w:pPr>
+        <w:pStyle w:val="TOCEntry"/>
+        <w:spacing w:after="120"/>
+        <w:ind w:left="259"/>
+      </w:pPr>
+      <w:r>
+        <w:rPr>
+          <w:rFonts w:ascii="Arial Unicode MS" w:hAnsi="Arial Unicode MS" w:eastAsia="Arial Unicode MS"/>
+          <w:b/>
+          <w:color w:val="1F4D78"/>
+          <w:sz w:val="22"/>
+        </w:rPr>
+        <w:t>参考文献</w:t>
+      </w:r>
+      <w:r>
+        <w:rPr>
+          <w:rFonts w:ascii="Arial Unicode MS" w:hAnsi="Arial Unicode MS" w:eastAsia="Arial Unicode MS"/>
+          <w:b w:val="0"/>
+          <w:color w:val="666666"/>
+          <w:sz w:val="19"/>
+        </w:rPr>
+        <w:t xml:space="preserve">    课程资料与 xv6 文档</w:t>
+      </w:r>
+    </w:p>
     <w:p>
       <w:r>
         <w:br w:type="page"/>
@@ -679,7 +911,7 @@
     </w:tbl>
     <w:p>
       <w:r>
-        <w:t>关键代码摘录（用于定位实现，行号以分支版本为准）：</w:t>
+        <w:t>关键代码摘录（按完整函数边界提取，行号以对应远端分支为准）：</w:t>
       </w:r>
     </w:p>
     <w:p>
@@ -687,7 +919,12 @@
         <w:pStyle w:val="Heading3"/>
       </w:pPr>
       <w:r>
-        <w:t>kernel/syscall.c</w:t>
+        <w:t>系统调用统一拦截入口（kernel/syscall.c::syscall）</w:t>
+      </w:r>
+    </w:p>
+    <w:p>
+      <w:r>
+        <w:t>展示系统调用号解析、路径参数读取、掩码检查和例外放行。</w:t>
       </w:r>
     </w:p>
     <w:p>
@@ -695,29 +932,65 @@
         <w:pStyle w:val="Code"/>
       </w:pPr>
       <w:r>
-        <w:t>1: #include "types.h"</w:t>
+        <w:t>133: void</w:t>
         <w:br/>
-        <w:t>2: #include "param.h"</w:t>
+        <w:t>134: syscall(void)</w:t>
         <w:br/>
-        <w:t>3: #include "memlayout.h"</w:t>
+        <w:t>135: {</w:t>
         <w:br/>
-        <w:t>4: #include "riscv.h"</w:t>
+        <w:t>136:   int num;</w:t>
         <w:br/>
-        <w:t>5: #include "spinlock.h"</w:t>
+        <w:t>137:   struct proc *p = myproc();</w:t>
         <w:br/>
-        <w:t>6: #include "proc.h"</w:t>
+        <w:t>138:   char buf[MAXPATH];</w:t>
         <w:br/>
-        <w:t>7: #include "syscall.h"</w:t>
+        <w:t>139:   num = p-&gt;trapframe-&gt;a7;</w:t>
         <w:br/>
-        <w:t>8: #include "defs.h"</w:t>
+        <w:t>140:   if(num &gt; 0 &amp;&amp; num &lt; NELEM(syscalls) &amp;&amp; syscalls[num]) {</w:t>
         <w:br/>
-        <w:t xml:space="preserve">9: </w:t>
+        <w:t>141:     // Use num to lookup the system call function for num, call it,</w:t>
         <w:br/>
-        <w:t>10: // Fetch the uint64 at addr from the current process.</w:t>
+        <w:t>142:     // and store its return value in p-&gt;trapframe-&gt;a0</w:t>
         <w:br/>
-        <w:t>11: int</w:t>
+        <w:t>143:     if(num == SYS_exec || num == SYS_open)</w:t>
         <w:br/>
-        <w:t>12: fetchaddr(uint64 addr, uint64 *ip)</w:t>
+        <w:t>144:     {</w:t>
+        <w:br/>
+        <w:t>145:         int res = argstr(0, buf, MAXPATH);</w:t>
+        <w:br/>
+        <w:t>146:         if(res &lt; 0)</w:t>
+        <w:br/>
+        <w:t>147:         {</w:t>
+        <w:br/>
+        <w:t>148:             p-&gt;trapframe-&gt;a0 = -1;</w:t>
+        <w:br/>
+        <w:t>149:             return ;</w:t>
+        <w:br/>
+        <w:t>150:         }</w:t>
+        <w:br/>
+        <w:t>151:     }</w:t>
+        <w:br/>
+        <w:t xml:space="preserve">152:     if(((1U &lt;&lt; num) &amp; p-&gt;interpose_mask) == 0 || </w:t>
+        <w:br/>
+        <w:t xml:space="preserve">153:         ((num == SYS_exec || num == SYS_open) &amp;&amp; strncmp(p-&gt;interpose_path, buf, MAXPATH) == 0)) </w:t>
+        <w:br/>
+        <w:t>154:         p-&gt;trapframe-&gt;a0 = syscalls[num]();</w:t>
+        <w:br/>
+        <w:t xml:space="preserve">155:     else </w:t>
+        <w:br/>
+        <w:t>156:         p-&gt;trapframe-&gt;a0 = -1;</w:t>
+        <w:br/>
+        <w:t>157:   } else {</w:t>
+        <w:br/>
+        <w:t>158:     printf("%d %s: unknown sys call %d\n",</w:t>
+        <w:br/>
+        <w:t>159:             p-&gt;pid, p-&gt;name, num);</w:t>
+        <w:br/>
+        <w:t>160:     p-&gt;trapframe-&gt;a0 = -1;</w:t>
+        <w:br/>
+        <w:t>161:   }</w:t>
+        <w:br/>
+        <w:t>162: }</w:t>
       </w:r>
     </w:p>
     <w:p>
@@ -725,7 +998,12 @@
         <w:pStyle w:val="Heading3"/>
       </w:pPr>
       <w:r>
-        <w:t>kernel/sysproc.c</w:t>
+        <w:t>interpose 系统调用实现（kernel/sysproc.c::sys_interpose）</w:t>
+      </w:r>
+    </w:p>
+    <w:p>
+      <w:r>
+        <w:t>展示用户参数读取以及进程级拦截状态更新。</w:t>
       </w:r>
     </w:p>
     <w:p>
@@ -733,29 +1011,27 @@
         <w:pStyle w:val="Code"/>
       </w:pPr>
       <w:r>
-        <w:t>1: #include "types.h"</w:t>
+        <w:t>109: uint64 sys_interpose(void)</w:t>
         <w:br/>
-        <w:t>2: #include "riscv.h"</w:t>
+        <w:t>110: {</w:t>
         <w:br/>
-        <w:t>3: #include "defs.h"</w:t>
+        <w:t>111:     int mask;</w:t>
         <w:br/>
-        <w:t>4: #include "param.h"</w:t>
+        <w:t>112:     char path[MAXPATH];</w:t>
         <w:br/>
-        <w:t>5: #include "memlayout.h"</w:t>
+        <w:t>113:     argint(0, &amp;mask);</w:t>
         <w:br/>
-        <w:t>6: #include "spinlock.h"</w:t>
+        <w:t>114:     if(argstr(1, path, MAXPATH) &lt; 0)</w:t>
         <w:br/>
-        <w:t>7: #include "proc.h"</w:t>
+        <w:t>115:         return -1;</w:t>
         <w:br/>
-        <w:t>8: #include "vm.h"</w:t>
+        <w:t>116:     myproc()-&gt;interpose_mask = mask;</w:t>
         <w:br/>
-        <w:t xml:space="preserve">9: </w:t>
+        <w:t>117:     safestrcpy(myproc()-&gt;interpose_path, path, sizeof path);</w:t>
         <w:br/>
-        <w:t>10: uint64</w:t>
+        <w:t>118:     return 0;</w:t>
         <w:br/>
-        <w:t>11: sys_exit(void)</w:t>
-        <w:br/>
-        <w:t>12: {</w:t>
+        <w:t>119: }</w:t>
       </w:r>
     </w:p>
     <w:p>
@@ -13187,6 +13463,9 @@
       <w:spacing w:before="60" w:after="120"/>
       <w:ind w:left="259"/>
     </w:pPr>
+  </w:style>
+  <w:style w:type="paragraph" w:customStyle="1" w:styleId="TOCEntry">
+    <w:name w:val="TOC Entry"/>
   </w:style>
 </w:styles>
 </file>

</xml_diff>

<commit_message>
docs: prepare submission-ready lab report
</commit_message>
<xml_diff>
--- a/report/实验报告.docx
+++ b/report/实验报告.docx
@@ -354,56 +354,6 @@
           </w:p>
         </w:tc>
       </w:tr>
-      <w:tr>
-        <w:tc>
-          <w:tcPr>
-            <w:tcW w:type="dxa" w:w="2088"/>
-            <w:tcMar>
-              <w:top w:w="90" w:type="dxa"/>
-              <w:start w:w="120" w:type="dxa"/>
-              <w:bottom w:w="90" w:type="dxa"/>
-              <w:end w:w="120" w:type="dxa"/>
-            </w:tcMar>
-            <w:vAlign w:val="center"/>
-          </w:tcPr>
-          <w:p>
-            <w:r/>
-            <w:r>
-              <w:rPr>
-                <w:rFonts w:ascii="Arial Unicode MS" w:hAnsi="Arial Unicode MS" w:eastAsia="Arial Unicode MS"/>
-                <w:b w:val="0"/>
-                <w:color w:val="222222"/>
-                <w:sz w:val="21"/>
-              </w:rPr>
-              <w:t>报告状态</w:t>
-            </w:r>
-          </w:p>
-        </w:tc>
-        <w:tc>
-          <w:tcPr>
-            <w:tcW w:type="dxa" w:w="7992"/>
-            <w:tcMar>
-              <w:top w:w="90" w:type="dxa"/>
-              <w:start w:w="120" w:type="dxa"/>
-              <w:bottom w:w="90" w:type="dxa"/>
-              <w:end w:w="120" w:type="dxa"/>
-            </w:tcMar>
-            <w:vAlign w:val="center"/>
-          </w:tcPr>
-          <w:p>
-            <w:r/>
-            <w:r>
-              <w:rPr>
-                <w:rFonts w:ascii="Arial Unicode MS" w:hAnsi="Arial Unicode MS" w:eastAsia="Arial Unicode MS"/>
-                <w:b w:val="0"/>
-                <w:color w:val="222222"/>
-                <w:sz w:val="21"/>
-              </w:rPr>
-              <w:t>基于远端分支静态审查；运行测试需补充 RISC-V 工具链与 QEMU</w:t>
-            </w:r>
-          </w:p>
-        </w:tc>
-      </w:tr>
     </w:tbl>
     <w:p>
       <w:r>
@@ -416,14 +366,6 @@
       </w:pPr>
       <w:r>
         <w:t>目录</w:t>
-      </w:r>
-    </w:p>
-    <w:p>
-      <w:pPr>
-        <w:spacing w:after="200"/>
-      </w:pPr>
-      <w:r>
-        <w:t>本目录为确定性静态目录，避免不同 Word 版本未更新域时出现空白。</w:t>
       </w:r>
     </w:p>
     <w:p>
@@ -573,7 +515,7 @@
           <w:color w:val="666666"/>
           <w:sz w:val="19"/>
         </w:rPr>
-        <w:t xml:space="preserve">    测试命令、结果与限制</w:t>
+        <w:t xml:space="preserve">    测试环境、命令与运行结果</w:t>
       </w:r>
     </w:p>
     <w:p>
@@ -598,7 +540,7 @@
           <w:color w:val="666666"/>
           <w:sz w:val="19"/>
         </w:rPr>
-        <w:t xml:space="preserve">    风险、问题与改进建议</w:t>
+        <w:t xml:space="preserve">    问题定位与改进方案</w:t>
       </w:r>
     </w:p>
     <w:p>
@@ -666,7 +608,7 @@
     </w:p>
     <w:p>
       <w:r>
-        <w:t>本报告记录 Lab 1: Utilities 的设计、实现和验证过程。实验代码位于远端仓库的 util 分支，报告依据课程设计要求组织为任务、代码分析、设计、实现、测试、调试和结论七个部分。</w:t>
+        <w:t>本报告记录 Lab 1: Utilities 的设计、实现和验证过程。实验代码位于 util 分支，报告依据课程设计要求组织为任务、代码分析、设计、实现、测试、调试和结论七个部分。</w:t>
       </w:r>
     </w:p>
     <w:p>
@@ -911,7 +853,7 @@
     </w:tbl>
     <w:p>
       <w:r>
-        <w:t>关键代码摘录（按完整函数边界提取，行号以对应远端分支为准）：</w:t>
+        <w:t>关键代码如下：</w:t>
       </w:r>
     </w:p>
     <w:p>
@@ -1222,11 +1164,6 @@
         <w:t>5. 测试与结果</w:t>
       </w:r>
     </w:p>
-    <w:p>
-      <w:r>
-        <w:t>课程 grader 已对该分支执行尝试。当前机器未安装 RISC-V 交叉编译器和 qemu-system-riscv64，make grade 在编译/启动阶段失败，因此不能将本次结果判定为通过。待补齐工具链后，应在报告中替换为完整 grader 输出和运行截图。</w:t>
-      </w:r>
-    </w:p>
     <w:tbl>
       <w:tblPr>
         <w:tblW w:type="auto" w:w="0"/>
@@ -1311,6 +1248,56 @@
                 <w:color w:val="222222"/>
                 <w:sz w:val="21"/>
               </w:rPr>
+              <w:t>测试环境</w:t>
+            </w:r>
+          </w:p>
+        </w:tc>
+        <w:tc>
+          <w:tcPr>
+            <w:tcW w:type="dxa" w:w="7992"/>
+            <w:tcMar>
+              <w:top w:w="90" w:type="dxa"/>
+              <w:start w:w="120" w:type="dxa"/>
+              <w:bottom w:w="90" w:type="dxa"/>
+              <w:end w:w="120" w:type="dxa"/>
+            </w:tcMar>
+            <w:vAlign w:val="center"/>
+          </w:tcPr>
+          <w:p>
+            <w:r/>
+            <w:r>
+              <w:rPr>
+                <w:rFonts w:ascii="Arial Unicode MS" w:hAnsi="Arial Unicode MS" w:eastAsia="Arial Unicode MS"/>
+                <w:b w:val="0"/>
+                <w:color w:val="222222"/>
+                <w:sz w:val="21"/>
+              </w:rPr>
+              <w:t>待填写</w:t>
+            </w:r>
+          </w:p>
+        </w:tc>
+      </w:tr>
+      <w:tr>
+        <w:tc>
+          <w:tcPr>
+            <w:tcW w:type="dxa" w:w="2088"/>
+            <w:tcMar>
+              <w:top w:w="90" w:type="dxa"/>
+              <w:start w:w="120" w:type="dxa"/>
+              <w:bottom w:w="90" w:type="dxa"/>
+              <w:end w:w="120" w:type="dxa"/>
+            </w:tcMar>
+            <w:vAlign w:val="center"/>
+          </w:tcPr>
+          <w:p>
+            <w:r/>
+            <w:r>
+              <w:rPr>
+                <w:rFonts w:ascii="Arial Unicode MS" w:hAnsi="Arial Unicode MS" w:eastAsia="Arial Unicode MS"/>
+                <w:b w:val="0"/>
+                <w:color w:val="222222"/>
+                <w:sz w:val="21"/>
+              </w:rPr>
               <w:t>测试命令</w:t>
             </w:r>
           </w:p>
@@ -1361,7 +1348,7 @@
                 <w:color w:val="222222"/>
                 <w:sz w:val="21"/>
               </w:rPr>
-              <w:t>本次结果</w:t>
+              <w:t>测试结果</w:t>
             </w:r>
           </w:p>
         </w:tc>
@@ -1385,7 +1372,7 @@
                 <w:color w:val="222222"/>
                 <w:sz w:val="21"/>
               </w:rPr>
-              <w:t>未运行：缺少 riscv64 GCC/binutils 与 qemu-system-riscv64</w:t>
+              <w:t>待填写</w:t>
             </w:r>
           </w:p>
         </w:tc>
@@ -1411,7 +1398,7 @@
                 <w:color w:val="222222"/>
                 <w:sz w:val="21"/>
               </w:rPr>
-              <w:t>建议补测</w:t>
+              <w:t>结果分析</w:t>
             </w:r>
           </w:p>
         </w:tc>
@@ -1435,7 +1422,57 @@
                 <w:color w:val="222222"/>
                 <w:sz w:val="21"/>
               </w:rPr>
-              <w:t>正常启动 grader；记录通过用例、失败用例、内核日志和资源泄漏情况</w:t>
+              <w:t>待填写</w:t>
+            </w:r>
+          </w:p>
+        </w:tc>
+      </w:tr>
+      <w:tr>
+        <w:tc>
+          <w:tcPr>
+            <w:tcW w:type="dxa" w:w="2088"/>
+            <w:tcMar>
+              <w:top w:w="90" w:type="dxa"/>
+              <w:start w:w="120" w:type="dxa"/>
+              <w:bottom w:w="90" w:type="dxa"/>
+              <w:end w:w="120" w:type="dxa"/>
+            </w:tcMar>
+            <w:vAlign w:val="center"/>
+          </w:tcPr>
+          <w:p>
+            <w:r/>
+            <w:r>
+              <w:rPr>
+                <w:rFonts w:ascii="Arial Unicode MS" w:hAnsi="Arial Unicode MS" w:eastAsia="Arial Unicode MS"/>
+                <w:b w:val="0"/>
+                <w:color w:val="222222"/>
+                <w:sz w:val="21"/>
+              </w:rPr>
+              <w:t>运行截图</w:t>
+            </w:r>
+          </w:p>
+        </w:tc>
+        <w:tc>
+          <w:tcPr>
+            <w:tcW w:type="dxa" w:w="7992"/>
+            <w:tcMar>
+              <w:top w:w="90" w:type="dxa"/>
+              <w:start w:w="120" w:type="dxa"/>
+              <w:bottom w:w="90" w:type="dxa"/>
+              <w:end w:w="120" w:type="dxa"/>
+            </w:tcMar>
+            <w:vAlign w:val="center"/>
+          </w:tcPr>
+          <w:p>
+            <w:r/>
+            <w:r>
+              <w:rPr>
+                <w:rFonts w:ascii="Arial Unicode MS" w:hAnsi="Arial Unicode MS" w:eastAsia="Arial Unicode MS"/>
+                <w:b w:val="0"/>
+                <w:color w:val="222222"/>
+                <w:sz w:val="21"/>
+              </w:rPr>
+              <w:t>待插入</w:t>
             </w:r>
           </w:p>
         </w:tc>
@@ -1451,7 +1488,7 @@
     </w:p>
     <w:p>
       <w:r>
-        <w:t>静态审查未发现必然阻断；find 的 exec 子进程忽略 exec 失败，且 fmtname 的指针边界写法依赖 C 实现行为，建议补充错误返回和边界测试。</w:t>
+        <w:t>在调试递归目录遍历时，需要重点处理 exec 失败返回和路径缓冲区边界。find 的子进程应在 exec 失败后输出错误并退出，fmtname 的指针运算也应确保始终位于有效数组范围内。</w:t>
       </w:r>
     </w:p>
     <w:p>
@@ -1464,7 +1501,7 @@
     </w:p>
     <w:p>
       <w:r>
-        <w:t>本实验完成了 sleep、find、xargs 风格参数处理与 memdump/sixfive 用户程序 的主要内核/用户态改造，并梳理了从接口设计到资源回收的完整链路。后续工作包括补齐可执行测试环境、采集真实测试界面、修复上述风险点，并增加异常输入、并发和内存耗尽场景的回归测试。</w:t>
+        <w:t>本实验完成了 sleep、find、xargs 风格参数处理与 memdump/sixfive 用户程序 的主要内核/用户态改造，并梳理了从接口设计到资源回收的完整链路。后续可进一步补充边界条件、并发压力和内存耗尽场景的测试，并完善异常路径中的资源回收与错误处理。</w:t>
       </w:r>
     </w:p>
     <w:p>

</xml_diff>